<commit_message>
Correct reference manuals for firmware 1.0.1
</commit_message>
<xml_diff>
--- a/docs/reference/Funciones.docx
+++ b/docs/reference/Funciones.docx
@@ -57,7 +57,7 @@
           <w:szCs w:val="20"/>
           <w:lang w:val="es-MX"/>
         </w:rPr>
-        <w:t>El presente documento detalla la especificacion funcional completa del dispositivo KeyVault / Huskey Pocket, un gestor de credenciales y boveda criptografica fisica basada en el hardware Waveshare ESP32-S3-Touch-LCD-2.8. El dispositivo opera como una unidad autonoma y aislada de red (air-gapped), asegurando la custodia y administracion de claves, contrasenas y tokens de autenticacion sin dependencia de servidores ni servicios en la nube.</w:t>
+        <w:t>Este documento resume las funciones de Huskey Pocket, un gestor de credenciales basado en la placa Waveshare ESP32-S3-Touch-LCD-2.8. El dispositivo funciona sin servicios de nube y puede enviar credenciales por USB o Bluetooth cuando el usuario lo solicita.</w:t>
       </w:r>
     </w:p>
     <w:p>
@@ -183,7 +183,7 @@
           <w:szCs w:val="20"/>
           <w:lang w:val="es-MX"/>
         </w:rPr>
-        <w:t xml:space="preserve">Reloj en Tiempo Real (RTC): </w:t>
+        <w:t>Reloj en Tiempo Real (RTC): el PCF85063 necesita una batería externa de respaldo para conservar la hora cuando el dispositivo está apagado.</w:t>
       </w:r>
       <w:r>
         <w:rPr>
@@ -191,7 +191,6 @@
           <w:szCs w:val="20"/>
           <w:lang w:val="es-MX"/>
         </w:rPr>
-        <w:t>Chip dedicado PCF85063 comunicado via bus I2C (Wire) con respaldo por bateria para garantizar el seguimiento temporal independiente.</w:t>
       </w:r>
     </w:p>
     <w:p>
@@ -346,7 +345,7 @@
           <w:szCs w:val="20"/>
           <w:lang w:val="es-MX"/>
         </w:rPr>
-        <w:t xml:space="preserve">Algoritmo de Cifrado: </w:t>
+        <w:t>Cifrado de la bóveda: los campos de las entradas se cifran con AES-256-CBC mediante mbedTLS. El modo CBC no proporciona autenticación integrada.</w:t>
       </w:r>
       <w:r>
         <w:rPr>
@@ -354,7 +353,6 @@
           <w:szCs w:val="20"/>
           <w:lang w:val="es-MX"/>
         </w:rPr>
-        <w:t>Cifrado simetrico autenticado AES-256 (GCM / CBC) implementado con soporte de aceleracion criptografica por hardware.</w:t>
       </w:r>
     </w:p>
     <w:p>
@@ -375,7 +373,7 @@
           <w:szCs w:val="20"/>
           <w:lang w:val="es-MX"/>
         </w:rPr>
-        <w:t xml:space="preserve">Derivacion de Claves: </w:t>
+        <w:t>Derivación de clave: PBKDF2-HMAC-SHA256 con 50 000 iteraciones para el PIN de la bóveda. Los respaldos .hky usan 100 000 iteraciones y una contraseña de exportación.</w:t>
       </w:r>
       <w:r>
         <w:rPr>
@@ -383,7 +381,6 @@
           <w:szCs w:val="20"/>
           <w:lang w:val="es-MX"/>
         </w:rPr>
-        <w:t>Derivacion de clave maestra a partir del PIN mediante el estandar PBKDF2-HMAC-SHA256 con 100,000 iteraciones y sal criptografica unica.</w:t>
       </w:r>
     </w:p>
     <w:p>
@@ -404,7 +401,7 @@
           <w:szCs w:val="20"/>
           <w:lang w:val="es-MX"/>
         </w:rPr>
-        <w:t xml:space="preserve">Autenticacion por PIN: </w:t>
+        <w:t>PIN: clave numérica de 6 dígitos.</w:t>
       </w:r>
       <w:r>
         <w:rPr>
@@ -412,7 +409,6 @@
           <w:szCs w:val="20"/>
           <w:lang w:val="es-MX"/>
         </w:rPr>
-        <w:t>Control de acceso mediante clave numerica de 4 a 8 digitos con validacion en tiempo constante frente a ataques de canal lateral.</w:t>
       </w:r>
     </w:p>
     <w:p>
@@ -491,7 +487,7 @@
           <w:szCs w:val="20"/>
           <w:lang w:val="es-MX"/>
         </w:rPr>
-        <w:t xml:space="preserve">Borrado Seguro (Secure Wipe): </w:t>
+        <w:t>Restablecimiento de fábrica: elimina los datos de la bóveda y preferencias locales; el PIN de FRP permanece para impedir la reconfiguración sin verificación. El borrado lógico no garantiza sobreescritura física de todas las celdas flash.</w:t>
       </w:r>
       <w:r>
         <w:rPr>
@@ -499,7 +495,6 @@
           <w:szCs w:val="20"/>
           <w:lang w:val="es-MX"/>
         </w:rPr>
-        <w:t>Restablecimiento integral con sobreescritura de sectores y purga criptografica de claves maestras.</w:t>
       </w:r>
     </w:p>
     <w:p>
@@ -539,7 +534,7 @@
           <w:szCs w:val="20"/>
           <w:lang w:val="es-MX"/>
         </w:rPr>
-        <w:t xml:space="preserve">Bloqueo por Arrebato (Snatch Lock): </w:t>
+        <w:t>Bloqueo por arrebato: mientras la bóveda está abierta, el firmware consulta el IMU QMI8658C y puede bloquear el dispositivo cuando aceleración y giro superan los umbrales del nivel elegido. Es una detección por software; no se garantiza un tiempo fijo de respuesta.</w:t>
       </w:r>
       <w:r>
         <w:rPr>
@@ -547,7 +542,6 @@
           <w:szCs w:val="20"/>
           <w:lang w:val="es-MX"/>
         </w:rPr>
-        <w:t>Supervision inercial mediante el sensor IMU QMI8658C. Si se detecta una variacion repentina y conjunta de aceleracion y giro angular (patron de tiron de manos), la boveda se cierra y el sistema entra en Deep Sleep en menos de 50 ms. Dispone de niveles de sensibilidad parametrizables: Desactivado, Bajo, Medio y Alto.</w:t>
       </w:r>
     </w:p>
     <w:p>
@@ -568,7 +562,7 @@
           <w:szCs w:val="20"/>
           <w:lang w:val="es-MX"/>
         </w:rPr>
-        <w:t xml:space="preserve">Interruptor de Hombre Muerto (Dead Man's Switch): </w:t>
+        <w:t>Modo perdido: permite elegir un plazo en días; si vence sin un desbloqueo real, el firmware ejecuta un restablecimiento de fábrica. Depende de que el RTC conserve la hora.</w:t>
       </w:r>
       <w:r>
         <w:rPr>
@@ -576,7 +570,6 @@
           <w:szCs w:val="20"/>
           <w:lang w:val="es-MX"/>
         </w:rPr>
-        <w:t>Temporizador de seguridad configurable en dias, semanas o meses. Si el dispositivo no registra un desbloqueo autenticado en el intervalo fijado, se activan rutinas defensivas de bloqueo forzado o eliminacion de credenciales.</w:t>
       </w:r>
     </w:p>
     <w:p>
@@ -1109,7 +1102,7 @@
           <w:szCs w:val="20"/>
           <w:lang w:val="es-MX"/>
         </w:rPr>
-        <w:t xml:space="preserve">Longitud Ajustable: </w:t>
+        <w:t>Generador: longitud de 8 a 32 caracteres.</w:t>
       </w:r>
       <w:r>
         <w:rPr>
@@ -1117,7 +1110,6 @@
           <w:szCs w:val="20"/>
           <w:lang w:val="es-MX"/>
         </w:rPr>
-        <w:t>Rango configurable entre 8 y 32 caracteres mediante control deslizante interactivo.</w:t>
       </w:r>
     </w:p>
     <w:p>
@@ -1272,7 +1264,7 @@
           <w:szCs w:val="20"/>
           <w:lang w:val="es-MX"/>
         </w:rPr>
-        <w:t xml:space="preserve">Teclado T9 (Grid 4x4): </w:t>
+        <w:t>Teclado T9 (Grid 4x4): Distribucion clasica de 16 teclas con pulsacion repetida (multitap) y pulsacion prolongada (long press) para numeros directos y atajos como .com. Incluye tecla OK para confirmar el texto.</w:t>
       </w:r>
       <w:r>
         <w:rPr>
@@ -1280,7 +1272,6 @@
           <w:szCs w:val="20"/>
           <w:lang w:val="es-MX"/>
         </w:rPr>
-        <w:t>Distribucion clasica de 16 teclas con pulsacion repetida (multitap) y pulsacion prolongada (long press) para numeros directos y atajos como .com.</w:t>
       </w:r>
     </w:p>
     <w:p>
@@ -1350,7 +1341,7 @@
           <w:szCs w:val="20"/>
           <w:lang w:val="es-MX"/>
         </w:rPr>
-        <w:t xml:space="preserve">Exportacion en CSV: </w:t>
+        <w:t>Importación y exportación CSV: usa la tarjeta microSD; el CSV queda en texto legible.</w:t>
       </w:r>
       <w:r>
         <w:rPr>
@@ -1358,7 +1349,6 @@
           <w:szCs w:val="20"/>
           <w:lang w:val="es-MX"/>
         </w:rPr>
-        <w:t>Descarga en formato tabular estandar para migracion a gestores de escritorio, precedida por avisos de seguridad.</w:t>
       </w:r>
     </w:p>
     <w:p>
@@ -1379,7 +1369,7 @@
           <w:szCs w:val="20"/>
           <w:lang w:val="es-MX"/>
         </w:rPr>
-        <w:t xml:space="preserve">Importacion Incremental: </w:t>
+        <w:t>Importación: procesa archivos .hky y .csv en pasos para mantener la interfaz disponible. La inicialización de la microSD también se realiza en segundo plano después de mostrar la pantalla de acceso.</w:t>
       </w:r>
       <w:r>
         <w:rPr>
@@ -1387,7 +1377,6 @@
           <w:szCs w:val="20"/>
           <w:lang w:val="es-MX"/>
         </w:rPr>
-        <w:t>Lectura diferida asincrona de archivos .hky y .csv que previene el bloqueo de la interfaz grafica durante la carga.</w:t>
       </w:r>
     </w:p>
     <w:p>
@@ -1408,7 +1397,7 @@
           <w:szCs w:val="20"/>
           <w:lang w:val="es-MX"/>
         </w:rPr>
-        <w:t xml:space="preserve">Purga de Archivos: </w:t>
+        <w:t>Limpieza de archivos administrados en /tmp y /export. La sobrescritura en memoria flash no garantiza la eliminación física de todas las copias.</w:t>
       </w:r>
       <w:r>
         <w:rPr>
@@ -1416,7 +1405,6 @@
           <w:szCs w:val="20"/>
           <w:lang w:val="es-MX"/>
         </w:rPr>
-        <w:t>Funcion de borrado seguro con sobreescritura de la carpeta de exportacion en la tarjeta SD.</w:t>
       </w:r>
     </w:p>
     <w:p>
@@ -1672,6 +1660,8 @@
       </w:r>
     </w:p>
     <w:sectPr>
+      <w:headerReference w:type="default" r:id="rId8"/>
+      <w:footerReference w:type="default" r:id="rId9"/>
       <w:pgSz w:w="12240" w:h="15840"/>
       <w:pgMar w:top="1440" w:right="1440" w:bottom="1440" w:left="1440" w:header="720" w:footer="720" w:gutter="0"/>
       <w:cols w:space="720"/>
@@ -1679,6 +1669,26 @@
     </w:sectPr>
   </w:body>
 </w:document>
+</file>
+
+<file path=word/footer1.xml><?xml version="1.0" encoding="utf-8"?>
+<w:ftr xmlns:m="http://schemas.openxmlformats.org/officeDocument/2006/math" xmlns:mc="http://schemas.openxmlformats.org/markup-compatibility/2006" xmlns:mo="http://schemas.microsoft.com/office/mac/office/2008/main" xmlns:mv="urn:schemas-microsoft-com:mac:vml" xmlns:o="urn:schemas-microsoft-com:office:office" xmlns:r="http://schemas.openxmlformats.org/officeDocument/2006/relationships" xmlns:v="urn:schemas-microsoft-com:vml" xmlns:w10="urn:schemas-microsoft-com:office:word" xmlns:w14="http://schemas.microsoft.com/office/word/2010/wordml" xmlns:w="http://schemas.openxmlformats.org/wordprocessingml/2006/main" xmlns:wne="http://schemas.microsoft.com/office/word/2006/wordml" xmlns:wp14="http://schemas.microsoft.com/office/word/2010/wordprocessingDrawing" xmlns:wp="http://schemas.openxmlformats.org/drawingml/2006/wordprocessingDrawing" xmlns:wpc="http://schemas.microsoft.com/office/word/2010/wordprocessingCanvas" xmlns:wpg="http://schemas.microsoft.com/office/word/2010/wordprocessingGroup" xmlns:wpi="http://schemas.microsoft.com/office/word/2010/wordprocessingInk" xmlns:wps="http://schemas.microsoft.com/office/word/2010/wordprocessingShape" mc:Ignorable="w14 wp14">
+  <w:p>
+    <w:pPr>
+      <w:pStyle w:val="Footer"/>
+    </w:pPr>
+  </w:p>
+</w:ftr>
+</file>
+
+<file path=word/header1.xml><?xml version="1.0" encoding="utf-8"?>
+<w:hdr xmlns:m="http://schemas.openxmlformats.org/officeDocument/2006/math" xmlns:mc="http://schemas.openxmlformats.org/markup-compatibility/2006" xmlns:mo="http://schemas.microsoft.com/office/mac/office/2008/main" xmlns:mv="urn:schemas-microsoft-com:mac:vml" xmlns:o="urn:schemas-microsoft-com:office:office" xmlns:r="http://schemas.openxmlformats.org/officeDocument/2006/relationships" xmlns:v="urn:schemas-microsoft-com:vml" xmlns:w10="urn:schemas-microsoft-com:office:word" xmlns:w14="http://schemas.microsoft.com/office/word/2010/wordml" xmlns:w="http://schemas.openxmlformats.org/wordprocessingml/2006/main" xmlns:wne="http://schemas.microsoft.com/office/word/2006/wordml" xmlns:wp14="http://schemas.microsoft.com/office/word/2010/wordprocessingDrawing" xmlns:wp="http://schemas.openxmlformats.org/drawingml/2006/wordprocessingDrawing" xmlns:wpc="http://schemas.microsoft.com/office/word/2010/wordprocessingCanvas" xmlns:wpg="http://schemas.microsoft.com/office/word/2010/wordprocessingGroup" xmlns:wpi="http://schemas.microsoft.com/office/word/2010/wordprocessingInk" xmlns:wps="http://schemas.microsoft.com/office/word/2010/wordprocessingShape" mc:Ignorable="w14 wp14">
+  <w:p>
+    <w:pPr>
+      <w:pStyle w:val="Header"/>
+    </w:pPr>
+  </w:p>
+</w:hdr>
 </file>
 
 <file path=word/numbering.xml><?xml version="1.0" encoding="utf-8"?>

</xml_diff>